<commit_message>
Replace field vectors with full-domain streamlines
</commit_message>
<xml_diff>
--- a/sparta_lid_driven_cavity_tutorial/docs/SPARTA_Lid_Driven_Cavity_Tutorial.docx
+++ b/sparta_lid_driven_cavity_tutorial/docs/SPARTA_Lid_Driven_Cavity_Tutorial.docx
@@ -2224,7 +2224,7 @@
       <w:r>
         <w:drawing>
           <wp:inline xmlns:a="http://schemas.openxmlformats.org/drawingml/2006/main" xmlns:pic="http://schemas.openxmlformats.org/drawingml/2006/picture">
-            <wp:extent cx="5897880" cy="2411577"/>
+            <wp:extent cx="5897880" cy="2365705"/>
             <wp:docPr id="2" name="Picture 2"/>
             <wp:cNvGraphicFramePr>
               <a:graphicFrameLocks noChangeAspect="1"/>
@@ -2245,7 +2245,7 @@
                   <pic:spPr>
                     <a:xfrm>
                       <a:off x="0" y="0"/>
-                      <a:ext cx="5897880" cy="2411577"/>
+                      <a:ext cx="5897880" cy="2365705"/>
                     </a:xfrm>
                     <a:prstGeom prst="rect"/>
                   </pic:spPr>
@@ -2268,7 +2268,7 @@
           <w:color w:val="5F6B76"/>
           <w:sz w:val="18"/>
         </w:rPr>
-        <w:t>Figure 2. Ensemble-mean temperature with streamlines (left) and speed with velocity vectors (right). A sigma-one-cell filter is used only for display.</w:t>
+        <w:t>Figure 2. Ensemble-mean temperature (left) and speed (right), both with continuous streamlines. A sigma-one-cell filter is used only for display.</w:t>
       </w:r>
     </w:p>
     <w:p>

</xml_diff>